<commit_message>
Speech: simplify wording across all slides (keep facts/standards), sharpen value-added emphasis on slide 4
</commit_message>
<xml_diff>
--- a/ТекстВыступления_Воробьев-1.docx
+++ b/ТекстВыступления_Воробьев-1.docx
@@ -83,7 +83,7 @@
           <w:szCs w:val="28"/>
           <w:lang w:val="ru-RU"/>
         </w:rPr>
-        <w:t xml:space="preserve">Актуальность темы обусловлена трансформацией рынка пожарной автоматики в 2024–2026 годах: запрет параллельного импорта, технологический сбор на импортную электронику и ужесточение ГОСТ Р 53325-2024 сформировали защищённую нишу для отечественного производства. Цель работы — разработка инвестиционного проекта предприятия по выпуску комбинированных пожарных извещателей. Для её достижения решены четыре задачи: анализ рынка, выбор показателей эффективности и инструмента моделирования, разработка производственной и организационной модели и построение финансовой модели в Project Expert.</w:t>
+        <w:t xml:space="preserve">Тема актуальна из-за изменений на рынке пожарной автоматики в 2024–2026 годах. Запрет параллельного импорта, сбор на импортную электронику и ужесточение ГОСТ Р 53325-2024 открыли защищённую нишу для отечественного производителя. Цель работы — разработать инвестиционный проект предприятия по выпуску комбинированных пожарных извещателей. Для этого я решил четыре задачи: проанализировал рынок, выбрал показатели эффективности и инструмент моделирования, разработал производственную и организационную модель и построил финансовую модель в Project Expert.</w:t>
       </w:r>
     </w:p>
     <w:p>
@@ -125,7 +125,7 @@
           <w:szCs w:val="28"/>
           <w:lang w:val="ru-RU"/>
         </w:rPr>
-        <w:t xml:space="preserve">Анализ рынка показал устойчивый рост: в 2025 году его объём составил 54 миллиарда рублей с приростом 10 процентов к предыдущему году, прогноз на 2026 год — 58,8 миллиарда. Запрет параллельного импорта вытеснил иностранные бренды, а основным драйвером спроса стал ввод 116 миллионов квадратных метров жилья и складов классов A и B.</w:t>
+        <w:t xml:space="preserve">Рынок устойчиво растёт: в 2025 году его объём составил 54 миллиарда рублей — на 10 процентов больше, чем годом ранее, а на 2026 год прогнозируется 58,8 миллиарда. Иностранные бренды ушли из-за запрета параллельного импорта, а главный драйвер спроса — ввод 116 миллионов квадратных метров жилья и складов классов A и B.</w:t>
       </w:r>
     </w:p>
     <w:p>
@@ -167,7 +167,7 @@
           <w:szCs w:val="28"/>
           <w:lang w:val="ru-RU"/>
         </w:rPr>
-        <w:t xml:space="preserve">Рыночные лидеры — «Болид» и «Рубеж» — работают на полных SMT-линиях с барьером входа от 120 миллионов рублей. Проектируемое предприятие использует гибридную модель: капиталоёмкий монтаж и литьё корпусов передаются на контрактное производство, а собственные ресурсы концентрируются на операциях с наивысшей добавленной стоимостью. Это снижает барьер входа до 5 миллионов рублей. Ниша свободна, поскольку крупным игрокам невыгодно малосерийное производство, а проект обеспечивает стопроцентный контроль каждого изделия.</w:t>
+        <w:t xml:space="preserve">Лидеры рынка — «Болид» и «Рубеж» — работают на полных SMT-линиях, и вход на рынок по их модели стоит от 120 миллионов рублей. Здесь и заключается главная идея проекта: самые капиталоёмкие операции — монтаж плат и литьё корпусов — я отдаю на контрактное производство, а у себя оставляю только то, что создаёт наибольшую добавленную стоимость: программирование, стопроцентный контроль качества и финальную сборку. Именно на этих операциях формируется ценность изделия и маржа. За счёт этого порог входа снижается со 120 до 5 миллионов рублей. Ниша при этом свободна: крупным игрокам малосерийное производство невыгодно, а проект даёт стопроцентный контроль каждого изделия.</w:t>
       </w:r>
     </w:p>
     <w:p>
@@ -209,7 +209,7 @@
           <w:szCs w:val="28"/>
           <w:lang w:val="ru-RU"/>
         </w:rPr>
-        <w:t xml:space="preserve">Продукт — извещатель пожарный комбинированный «Сигнал», объединяющий дымовой и тепловой каналы в одном корпусе. Он оснащён встроенным изолятором короткого замыкания по требованию СП 484 и обеспечивает помехозащищённость 10 вольт на метр по ГОСТ Р 53325-2024. Вычислительное ядро — микроконтроллер WCH архитектуры RISC-V. При отпускной цене 1800 рублей валовая маржа достигает 79 процентов.</w:t>
+        <w:t xml:space="preserve">Продукт — комбинированный извещатель «Сигнал»: дымовой и тепловой каналы в одном корпусе. В нём есть встроенный изолятор короткого замыкания по требованию СП 484 и помехозащищённость 10 вольт на метр по ГОСТ Р 53325-2024. В основе — микроконтроллер WCH на архитектуре RISC-V. При отпускной цене 1800 рублей валовая маржа достигает 79 процентов.</w:t>
       </w:r>
     </w:p>
     <w:p>
@@ -251,7 +251,7 @@
           <w:szCs w:val="28"/>
           <w:lang w:val="ru-RU"/>
         </w:rPr>
-        <w:t xml:space="preserve">Прямая себестоимость изделия составляет 382 рубля, маржинальная прибыль — 1418 рублей. Высокая маржа достигается выбором микроконтроллера RISC-V стоимостью 23 рубля против 84 у аналога STM32, передачей монтажа на контрактное производство и применением собственной пресс-формы корпуса.</w:t>
+        <w:t xml:space="preserve">Прямая себестоимость изделия — 382 рубля, а маржинальная прибыль — 1418 рублей. Такая маржа складывается из трёх решений: микроконтроллер RISC-V за 23 рубля вместо 84 у аналога STM32, монтаж на контрактном производстве и собственная пресс-форма корпуса. То есть основная стоимость создаётся на наших операциях, а не на закупке.</w:t>
       </w:r>
     </w:p>
     <w:p>
@@ -293,7 +293,7 @@
           <w:szCs w:val="28"/>
           <w:lang w:val="ru-RU"/>
         </w:rPr>
-        <w:t xml:space="preserve">Технологический процесс включает пять этапов: входной контроль комплектующих, ручной монтаж и сборку, программирование микроконтроллера, стопроцентный автотест на стенде и маркировку с сериализацией. Ключевые операции — программирование и выходной контроль — автоматизированы и регистрируются в MES-системе.</w:t>
+        <w:t xml:space="preserve">Технологический процесс состоит из пяти этапов: входной контроль комплектующих, ручной монтаж и сборка, программирование микроконтроллера, стопроцентный автотест на стенде и маркировка с серийным номером. Два ключевых этапа — программирование и выходной контроль — автоматизированы и фиксируются в MES-системе.</w:t>
       </w:r>
     </w:p>
     <w:p>
@@ -335,7 +335,7 @@
           <w:szCs w:val="28"/>
           <w:lang w:val="ru-RU"/>
         </w:rPr>
-        <w:t xml:space="preserve">Стенд «СИ-ТДК» объединяет аэродинамический дымовой канал и термокамеру теплового канала и обеспечивает стопроцентный выходной контроль каждого изделия вместо выборочного. MES-система ведёт сквозную прослеживаемость по серийному номеру: без цифрового протокола изделие не подлежит отгрузке. Это исключает попадание скрытого брака в партию и является ключевым конкурентным преимуществом в сегменте B2B.</w:t>
+        <w:t xml:space="preserve">Стенд «СИ-ТДК» объединяет дымовой канал и термокамеру теплового канала и проверяет каждое изделие, а не выборку. MES-система ведёт прослеживаемость по серийному номеру: пока нет цифрового протокола, изделие нельзя отгрузить. Это не пропускает скрытый брак в партию и становится сильным преимуществом в сегменте B2B.</w:t>
       </w:r>
     </w:p>
     <w:p>
@@ -377,7 +377,7 @@
           <w:szCs w:val="28"/>
           <w:lang w:val="ru-RU"/>
         </w:rPr>
-        <w:t xml:space="preserve">Бюджет капитальных вложений составляет 4,97 миллиона рублей. Основная статья — испытательный стенд «СИ-ТДК» стоимостью 2,41 миллиона рублей, то есть около половины бюджета. В состав оборудования также входят климатическая камера, программатор и паяльная станция.</w:t>
+        <w:t xml:space="preserve">Капитальные вложения — 4,97 миллиона рублей. Главная статья — испытательный стенд «СИ-ТДК» за 2,41 миллиона, это около половины бюджета. Кроме него закупаются климатическая камера, программатор и паяльная станция.</w:t>
       </w:r>
     </w:p>
     <w:p>
@@ -419,7 +419,7 @@
           <w:szCs w:val="28"/>
           <w:lang w:val="ru-RU"/>
         </w:rPr>
-        <w:t xml:space="preserve">Разработка финансовой модели в Project Expert начиналась с настройки макроокружения. Старт проекта — 1 марта 2026 года, горизонт планирования — 36 месяцев, выход на операционную деятельность — 1 июля. Налогообложение — УСН «доходы минус расходы» по ставке 15 процентов, ставка дисконтирования — 14,5 процента с учётом ключевой ставки ЦБ.</w:t>
+        <w:t xml:space="preserve">Финансовую модель в Project Expert я начал с настройки макроокружения. Старт проекта — 1 марта 2026 года, горизонт планирования — 36 месяцев, выход на операционную деятельность — 1 июля. Налоги — УСН «доходы минус расходы» по ставке 15 процентов, ставка дисконтирования — 14,5 процента с учётом ключевой ставки ЦБ.</w:t>
       </w:r>
     </w:p>
     <w:p>
@@ -461,7 +461,7 @@
           <w:szCs w:val="28"/>
           <w:lang w:val="ru-RU"/>
         </w:rPr>
-        <w:t xml:space="preserve">Инвестиционная фаза занимает четыре месяца — с марта по июнь 2026 года — и включает ремонт помещения, монтаж ESD-зоны, пусконаладку оборудования и сертификацию по техническому регламенту ЕАЭС 043/2017. Критический путь определяется заказом пресс-формы длительностью восемь недель. Старт продаж — июль 2026 года.</w:t>
+        <w:t xml:space="preserve">Инвестиционная фаза длится четыре месяца — с марта по июнь 2026 года. За это время идёт ремонт помещения, монтаж ESD-зоны, пусконаладка оборудования и сертификация по техническому регламенту ЕАЭС 043/2017. Самое долгое звено в плане — изготовление пресс-формы, восемь недель, оно и задаёт критический путь. Продажи стартуют в июле 2026 года.</w:t>
       </w:r>
     </w:p>
     <w:p>
@@ -503,7 +503,7 @@
           <w:szCs w:val="28"/>
           <w:lang w:val="ru-RU"/>
         </w:rPr>
-        <w:t xml:space="preserve">Штат предприятия включает пять должностей: директор, главный инженер, техник ОТК и два сборщика радиоэлектронной аппаратуры. Ежемесячный фонд оплаты труда «на руки» составляет 370 тысяч рублей, а с учётом страховых взносов — 455 тысяч рублей.</w:t>
+        <w:t xml:space="preserve">В штате пять должностей: директор, главный инженер, техник ОТК и два сборщика радиоэлектронной аппаратуры. Фонд оплаты труда «на руки» — 370 тысяч рублей в месяц, а со страховыми взносами — 455 тысяч.</w:t>
       </w:r>
     </w:p>
     <w:p>
@@ -545,7 +545,7 @@
           <w:szCs w:val="28"/>
           <w:lang w:val="ru-RU"/>
         </w:rPr>
-        <w:t xml:space="preserve">Финансирование разделено на два источника: 2 миллиона рублей собственных средств и 7 миллионов заёмных по льготной программе 1764 под 12 процентов годовых сроком 35 месяцев с отсрочкой погашения тела долга на 7 месяцев. Проект проходит по программе как микропредприятие приоритетной отрасли — производства радиоэлектроники. Капитализация процентов в инвестиционной фазе сохраняет операционную ликвидность на старте.</w:t>
+        <w:t xml:space="preserve">Финансирование складывается из двух источников: 2 миллиона рублей собственных средств и 7 миллионов заёмных по льготной программе 1764 — под 12 процентов годовых на 35 месяцев, с отсрочкой выплаты тела долга на 7 месяцев. Проект проходит по этой программе как микропредприятие приоритетной отрасли — производства радиоэлектроники. В инвестиционной фазе проценты капитализируются, и это сохраняет ликвидность на старте.</w:t>
       </w:r>
     </w:p>
     <w:p>
@@ -587,7 +587,7 @@
           <w:szCs w:val="28"/>
           <w:lang w:val="ru-RU"/>
         </w:rPr>
-        <w:t xml:space="preserve">На графике прибылей и убытков основные кривые — чистый объём продаж и валовая прибыль. Первые четыре месяца они равны нулю: идёт инвестиционная фаза без продаж. С июля 2026 года обе кривые растут, а их пилообразный характер отражает сезонность спроса; валовая прибыль устойчиво держится выше линии суммарных прямых издержек, что подтверждает высокую маржинальность. На графике окупаемости ключевая линия — баланс наличности на конец периода: после расходов инвестиционной фазы она снижается, но не уходит в отрицательную зону, то есть кассовых разрывов нет, а затем за счёт операционного денежного потока устойчиво растёт. Точка её разворота вверх соответствует выходу проекта на окупаемость.</w:t>
+        <w:t xml:space="preserve">На графике прибылей и убытков главные кривые — чистый объём продаж и валовая прибыль. Первые четыре месяца они на нуле: идёт инвестиционная фаза без продаж. С июля 2026 года обе растут, а их пилообразная форма отражает сезонность спроса. Валовая прибыль всё время держится выше суммарных прямых издержек — это и подтверждает высокую маржинальность. На графике окупаемости главная линия — баланс наличности на конец периода. После затрат инвестиционной фазы она снижается, но в минус не уходит, то есть кассовых разрывов нет, а дальше за счёт операционного потока уверенно растёт. Точка, где она разворачивается вверх, и есть выход проекта на окупаемость.</w:t>
       </w:r>
     </w:p>
     <w:p>
@@ -629,7 +629,7 @@
           <w:szCs w:val="28"/>
           <w:lang w:val="ru-RU"/>
         </w:rPr>
-        <w:t xml:space="preserve">Показатели эффективности подтверждают инвестиционную привлекательность проекта: чистый приведённый доход — 4,29 миллиона рублей, внутренняя норма доходности — почти 52 процента, индекс прибыльности — 1,61, дисконтированный срок окупаемости — 26 месяцев. Анализ чувствительности показал, что наиболее критичным фактором является цена реализации; при этом проект сохраняет устойчивость к снижению объёма сбыта на 10–15 процентов и к росту капитальных вложений.</w:t>
+        <w:t xml:space="preserve">Показатели эффективности подтверждают привлекательность проекта: чистый приведённый доход — 4,29 миллиона рублей, внутренняя норма доходности — почти 52 процента, индекс прибыльности — 1,61, дисконтированный срок окупаемости — 26 месяцев. Анализ чувствительности показал, что сильнее всего на проект влияет цена реализации. При этом он остаётся устойчивым к падению сбыта на 10–15 процентов и к росту капитальных вложений.</w:t>
       </w:r>
     </w:p>
     <w:p>
@@ -671,7 +671,7 @@
           <w:szCs w:val="28"/>
           <w:lang w:val="ru-RU"/>
         </w:rPr>
-        <w:t xml:space="preserve">В работе обоснована технико-экономическая целесообразность проекта в защищённой рыночной нише, разработана модель гибридной автоматизации со стопроцентным контролем качества на стенде «СИ-ТДК», а финансовая модель в Project Expert подтвердила эффективность по всем критериям. Проект рекомендован к реализации и пригоден как основа бизнес-плана для привлечения финансирования. Доклад окончен. Спасибо за внимание!</w:t>
+        <w:t xml:space="preserve">В работе обоснована технико-экономическая целесообразность проекта в защищённой нише, построена гибридная модель производства со стопроцентным контролем качества на стенде «СИ-ТДК», где предприятие сосредоточено на операциях с наибольшей добавленной стоимостью. Финансовая модель в Project Expert подтвердила эффективность по всем критериям. Проект рекомендован к реализации и может служить основой бизнес-плана для привлечения финансирования. Доклад окончен. Спасибо за внимание!</w:t>
       </w:r>
     </w:p>
     <w:sectPr>

</xml_diff>

<commit_message>
Speech: slide 15 keep only NPV & payback + neutral sensitivity wording; impersonal style; bold slide headings
</commit_message>
<xml_diff>
--- a/ТекстВыступления_Воробьев-1.docx
+++ b/ТекстВыступления_Воробьев-1.docx
@@ -15,6 +15,8 @@
       </w:pPr>
       <w:r>
         <w:rPr>
+          <w:b/>
+          <w:bCs/>
           <w:rFonts w:ascii="Times New Roman" w:hAnsi="Times New Roman" w:cs="Times New Roman"/>
           <w:sz w:val="28"/>
           <w:szCs w:val="28"/>
@@ -57,6 +59,8 @@
       </w:pPr>
       <w:r>
         <w:rPr>
+          <w:b/>
+          <w:bCs/>
           <w:rFonts w:ascii="Times New Roman" w:hAnsi="Times New Roman" w:cs="Times New Roman"/>
           <w:sz w:val="28"/>
           <w:szCs w:val="28"/>
@@ -83,7 +87,7 @@
           <w:szCs w:val="28"/>
           <w:lang w:val="ru-RU"/>
         </w:rPr>
-        <w:t xml:space="preserve">Тема актуальна из-за изменений на рынке пожарной автоматики в 2024–2026 годах. Запрет параллельного импорта, сбор на импортную электронику и ужесточение ГОСТ Р 53325-2024 открыли защищённую нишу для отечественного производителя. Цель работы — разработать инвестиционный проект предприятия по выпуску комбинированных пожарных извещателей. Для этого я решил четыре задачи: проанализировал рынок, выбрал показатели эффективности и инструмент моделирования, разработал производственную и организационную модель и построил финансовую модель в Project Expert.</w:t>
+        <w:t xml:space="preserve">Тема актуальна из-за изменений на рынке пожарной автоматики в 2024–2026 годах. Запрет параллельного импорта, сбор на импортную электронику и ужесточение ГОСТ Р 53325-2024 открыли защищённую нишу для отечественного производителя. Цель работы — разработать инвестиционный проект предприятия по выпуску комбинированных пожарных извещателей. Для её достижения решены четыре задачи: анализ рынка, выбор показателей эффективности и инструмента моделирования, разработка производственной и организационной модели и построение финансовой модели в Project Expert.</w:t>
       </w:r>
     </w:p>
     <w:p>
@@ -99,6 +103,8 @@
       </w:pPr>
       <w:r>
         <w:rPr>
+          <w:b/>
+          <w:bCs/>
           <w:rFonts w:ascii="Times New Roman" w:hAnsi="Times New Roman" w:cs="Times New Roman"/>
           <w:sz w:val="28"/>
           <w:szCs w:val="28"/>
@@ -141,6 +147,8 @@
       </w:pPr>
       <w:r>
         <w:rPr>
+          <w:b/>
+          <w:bCs/>
           <w:rFonts w:ascii="Times New Roman" w:hAnsi="Times New Roman" w:cs="Times New Roman"/>
           <w:sz w:val="28"/>
           <w:szCs w:val="28"/>
@@ -167,7 +175,7 @@
           <w:szCs w:val="28"/>
           <w:lang w:val="ru-RU"/>
         </w:rPr>
-        <w:t xml:space="preserve">Лидеры рынка — «Болид» и «Рубеж» — работают на полных SMT-линиях, и вход на рынок по их модели стоит от 120 миллионов рублей. Здесь и заключается главная идея проекта: самые капиталоёмкие операции — монтаж плат и литьё корпусов — я отдаю на контрактное производство, а у себя оставляю только то, что создаёт наибольшую добавленную стоимость: программирование, стопроцентный контроль качества и финальную сборку. Именно на этих операциях формируется ценность изделия и маржа. За счёт этого порог входа снижается со 120 до 5 миллионов рублей. Ниша при этом свободна: крупным игрокам малосерийное производство невыгодно, а проект даёт стопроцентный контроль каждого изделия.</w:t>
+        <w:t xml:space="preserve">Лидеры рынка — «Болид» и «Рубеж» — работают на полных SMT-линиях, и вход на рынок по их модели стоит от 120 миллионов рублей. В этом и состоит главная идея проекта: самые капиталоёмкие операции — монтаж плат и литьё корпусов — передаются на контрактное производство, а на собственных мощностях остаются операции с наибольшей добавленной стоимостью: программирование, стопроцентный контроль качества и финальная сборка. Именно на них формируется ценность изделия и маржа. За счёт этого порог входа снижается со 120 до 5 миллионов рублей. Ниша при этом свободна: крупным игрокам малосерийное производство невыгодно, а проект обеспечивает стопроцентный контроль каждого изделия.</w:t>
       </w:r>
     </w:p>
     <w:p>
@@ -183,6 +191,8 @@
       </w:pPr>
       <w:r>
         <w:rPr>
+          <w:b/>
+          <w:bCs/>
           <w:rFonts w:ascii="Times New Roman" w:hAnsi="Times New Roman" w:cs="Times New Roman"/>
           <w:sz w:val="28"/>
           <w:szCs w:val="28"/>
@@ -225,6 +235,8 @@
       </w:pPr>
       <w:r>
         <w:rPr>
+          <w:b/>
+          <w:bCs/>
           <w:rFonts w:ascii="Times New Roman" w:hAnsi="Times New Roman" w:cs="Times New Roman"/>
           <w:sz w:val="28"/>
           <w:szCs w:val="28"/>
@@ -251,7 +263,7 @@
           <w:szCs w:val="28"/>
           <w:lang w:val="ru-RU"/>
         </w:rPr>
-        <w:t xml:space="preserve">Прямая себестоимость изделия — 382 рубля, а маржинальная прибыль — 1418 рублей. Такая маржа складывается из трёх решений: микроконтроллер RISC-V за 23 рубля вместо 84 у аналога STM32, монтаж на контрактном производстве и собственная пресс-форма корпуса. То есть основная стоимость создаётся на наших операциях, а не на закупке.</w:t>
+        <w:t xml:space="preserve">Прямая себестоимость изделия — 382 рубля, а маржинальная прибыль — 1418 рублей. Такая маржа складывается из трёх решений: микроконтроллер RISC-V за 23 рубля вместо 84 у аналога STM32, монтаж на контрактном производстве и собственная пресс-форма корпуса. То есть основная стоимость создаётся на собственных операциях, а не на закупке.</w:t>
       </w:r>
     </w:p>
     <w:p>
@@ -267,6 +279,8 @@
       </w:pPr>
       <w:r>
         <w:rPr>
+          <w:b/>
+          <w:bCs/>
           <w:rFonts w:ascii="Times New Roman" w:hAnsi="Times New Roman" w:cs="Times New Roman"/>
           <w:sz w:val="28"/>
           <w:szCs w:val="28"/>
@@ -309,6 +323,8 @@
       </w:pPr>
       <w:r>
         <w:rPr>
+          <w:b/>
+          <w:bCs/>
           <w:rFonts w:ascii="Times New Roman" w:hAnsi="Times New Roman" w:cs="Times New Roman"/>
           <w:sz w:val="28"/>
           <w:szCs w:val="28"/>
@@ -351,6 +367,8 @@
       </w:pPr>
       <w:r>
         <w:rPr>
+          <w:b/>
+          <w:bCs/>
           <w:rFonts w:ascii="Times New Roman" w:hAnsi="Times New Roman" w:cs="Times New Roman"/>
           <w:sz w:val="28"/>
           <w:szCs w:val="28"/>
@@ -393,6 +411,8 @@
       </w:pPr>
       <w:r>
         <w:rPr>
+          <w:b/>
+          <w:bCs/>
           <w:rFonts w:ascii="Times New Roman" w:hAnsi="Times New Roman" w:cs="Times New Roman"/>
           <w:sz w:val="28"/>
           <w:szCs w:val="28"/>
@@ -419,7 +439,7 @@
           <w:szCs w:val="28"/>
           <w:lang w:val="ru-RU"/>
         </w:rPr>
-        <w:t xml:space="preserve">Финансовую модель в Project Expert я начал с настройки макроокружения. Старт проекта — 1 марта 2026 года, горизонт планирования — 36 месяцев, выход на операционную деятельность — 1 июля. Налоги — УСН «доходы минус расходы» по ставке 15 процентов, ставка дисконтирования — 14,5 процента с учётом ключевой ставки ЦБ.</w:t>
+        <w:t xml:space="preserve">Разработка финансовой модели в Project Expert начиналась с настройки макроокружения. Старт проекта — 1 марта 2026 года, горизонт планирования — 36 месяцев, выход на операционную деятельность — 1 июля. Налоги — УСН «доходы минус расходы» по ставке 15 процентов, ставка дисконтирования — 14,5 процента с учётом ключевой ставки ЦБ.</w:t>
       </w:r>
     </w:p>
     <w:p>
@@ -435,6 +455,8 @@
       </w:pPr>
       <w:r>
         <w:rPr>
+          <w:b/>
+          <w:bCs/>
           <w:rFonts w:ascii="Times New Roman" w:hAnsi="Times New Roman" w:cs="Times New Roman"/>
           <w:sz w:val="28"/>
           <w:szCs w:val="28"/>
@@ -477,6 +499,8 @@
       </w:pPr>
       <w:r>
         <w:rPr>
+          <w:b/>
+          <w:bCs/>
           <w:rFonts w:ascii="Times New Roman" w:hAnsi="Times New Roman" w:cs="Times New Roman"/>
           <w:sz w:val="28"/>
           <w:szCs w:val="28"/>
@@ -519,6 +543,8 @@
       </w:pPr>
       <w:r>
         <w:rPr>
+          <w:b/>
+          <w:bCs/>
           <w:rFonts w:ascii="Times New Roman" w:hAnsi="Times New Roman" w:cs="Times New Roman"/>
           <w:sz w:val="28"/>
           <w:szCs w:val="28"/>
@@ -561,6 +587,8 @@
       </w:pPr>
       <w:r>
         <w:rPr>
+          <w:b/>
+          <w:bCs/>
           <w:rFonts w:ascii="Times New Roman" w:hAnsi="Times New Roman" w:cs="Times New Roman"/>
           <w:sz w:val="28"/>
           <w:szCs w:val="28"/>
@@ -603,6 +631,8 @@
       </w:pPr>
       <w:r>
         <w:rPr>
+          <w:b/>
+          <w:bCs/>
           <w:rFonts w:ascii="Times New Roman" w:hAnsi="Times New Roman" w:cs="Times New Roman"/>
           <w:sz w:val="28"/>
           <w:szCs w:val="28"/>
@@ -629,7 +659,7 @@
           <w:szCs w:val="28"/>
           <w:lang w:val="ru-RU"/>
         </w:rPr>
-        <w:t xml:space="preserve">Показатели эффективности подтверждают привлекательность проекта: чистый приведённый доход — 4,29 миллиона рублей, внутренняя норма доходности — почти 52 процента, индекс прибыльности — 1,61, дисконтированный срок окупаемости — 26 месяцев. Анализ чувствительности показал, что сильнее всего на проект влияет цена реализации. При этом он остаётся устойчивым к падению сбыта на 10–15 процентов и к росту капитальных вложений.</w:t>
+        <w:t xml:space="preserve">Ключевые показатели эффективности проекта — чистый приведённый доход 4,29 миллиона рублей и дисконтированный срок окупаемости 26 месяцев. Анализ чувствительности показал, что проект сохраняет устойчивость к изменению основных факторов, а его параметры находятся в пределах значений, нормальных для предприятий такого типа.</w:t>
       </w:r>
     </w:p>
     <w:p>
@@ -645,6 +675,8 @@
       </w:pPr>
       <w:r>
         <w:rPr>
+          <w:b/>
+          <w:bCs/>
           <w:rFonts w:ascii="Times New Roman" w:hAnsi="Times New Roman" w:cs="Times New Roman"/>
           <w:sz w:val="28"/>
           <w:szCs w:val="28"/>

</xml_diff>

<commit_message>
Speech: remove payroll sentence (s12) & free-niche sentence (s4); rewrite s7 process simpler to match flowchart
</commit_message>
<xml_diff>
--- a/ТекстВыступления_Воробьев-1.docx
+++ b/ТекстВыступления_Воробьев-1.docx
@@ -175,7 +175,7 @@
           <w:szCs w:val="28"/>
           <w:lang w:val="ru-RU"/>
         </w:rPr>
-        <w:t xml:space="preserve">Лидеры рынка — «Болид» и «Рубеж» — работают на полных SMT-линиях, и вход на рынок по их модели стоит от 120 миллионов рублей. В этом и состоит главная идея проекта: самые капиталоёмкие операции — монтаж плат и литьё корпусов — передаются на контрактное производство, а на собственных мощностях остаются операции с наибольшей добавленной стоимостью: программирование, стопроцентный контроль качества и финальная сборка. Именно на них формируется ценность изделия и маржа. За счёт этого порог входа снижается со 120 до 5 миллионов рублей. Ниша при этом свободна: крупным игрокам малосерийное производство невыгодно, а проект обеспечивает стопроцентный контроль каждого изделия.</w:t>
+        <w:t xml:space="preserve">Лидеры рынка — «Болид» и «Рубеж» — работают на полных SMT-линиях, и вход на рынок по их модели стоит от 120 миллионов рублей. В этом и состоит главная идея проекта: самые капиталоёмкие операции — монтаж плат и литьё корпусов — передаются на контрактное производство, а на собственных мощностях остаются операции с наибольшей добавленной стоимостью: программирование, стопроцентный контроль качества и финальная сборка. Именно на них формируется ценность изделия и маржа. За счёт этого порог входа снижается со 120 до 5 миллионов рублей.</w:t>
       </w:r>
     </w:p>
     <w:p>
@@ -307,7 +307,7 @@
           <w:szCs w:val="28"/>
           <w:lang w:val="ru-RU"/>
         </w:rPr>
-        <w:t xml:space="preserve">Технологический процесс состоит из пяти этапов: входной контроль комплектующих, ручной монтаж и сборка, программирование микроконтроллера, стопроцентный автотест на стенде и маркировка с серийным номером. Два ключевых этапа — программирование и выходной контроль — автоматизированы и фиксируются в MES-системе.</w:t>
+        <w:t xml:space="preserve">Технологический процесс простой и логичный. Сначала — входной контроль комплектующих, затем ручной монтаж, сборка и прошивка микроконтроллера. После этого каждое изделие тестируется на стенде «СИ-ТДК». Если изделие проходит тест, оно получает серийный номер, маркировку и идёт на упаковку и склад. Если нет — MES-система блокирует печать этикетки, и бракованное изделие просто не может попасть к заказчику.</w:t>
       </w:r>
     </w:p>
     <w:p>
@@ -527,7 +527,7 @@
           <w:szCs w:val="28"/>
           <w:lang w:val="ru-RU"/>
         </w:rPr>
-        <w:t xml:space="preserve">В штате пять должностей: директор, главный инженер, техник ОТК и два сборщика радиоэлектронной аппаратуры. Фонд оплаты труда «на руки» — 370 тысяч рублей в месяц, а со страховыми взносами — 455 тысяч.</w:t>
+        <w:t xml:space="preserve">В штате пять должностей: директор, главный инженер, техник ОТК и два сборщика радиоэлектронной аппаратуры.</w:t>
       </w:r>
     </w:p>
     <w:p>

</xml_diff>